<commit_message>
fix children ssn and other answer issues
</commit_message>
<xml_diff>
--- a/docassemble/MODivorceForms/data/templates/mo_divorce_forms_next_steps.docx
+++ b/docassemble/MODivorceForms/data/templates/mo_divorce_forms_next_steps.docx
@@ -1024,7 +1024,7 @@
           <w:sz w:val="28"/>
           <w:szCs w:val="28"/>
         </w:rPr>
-        <w:t xml:space="preserve"> and len(</w:t>
+        <w:t xml:space="preserve"> and </w:t>
       </w:r>
       <w:r>
         <w:rPr>
@@ -1040,7 +1040,7 @@
           <w:sz w:val="28"/>
           <w:szCs w:val="28"/>
         </w:rPr>
-        <w:t>) == 0</w:t>
+        <w:t xml:space="preserve"> == 0</w:t>
       </w:r>
       <w:r>
         <w:rPr>
@@ -1198,23 +1198,7 @@
                 <w:b/>
                 <w:bCs/>
               </w:rPr>
-              <w:t xml:space="preserve">Unredacted                                           </w:t>
-            </w:r>
-            <w:r>
-              <w:rPr>
-                <w:rFonts w:ascii="Times New Roman" w:hAnsi="Times New Roman" w:cs="Times New Roman"/>
-                <w:b/>
-                <w:bCs/>
-              </w:rPr>
-              <w:t xml:space="preserve">              </w:t>
-            </w:r>
-            <w:r>
-              <w:rPr>
-                <w:rFonts w:ascii="Times New Roman" w:hAnsi="Times New Roman" w:cs="Times New Roman"/>
-                <w:b/>
-                <w:bCs/>
-              </w:rPr>
-              <w:t xml:space="preserve">     Redacted</w:t>
+              <w:t>Unredacted                                                              Redacted</w:t>
             </w:r>
           </w:p>
         </w:tc>
@@ -1817,21 +1801,7 @@
           <w:sz w:val="32"/>
         </w:rPr>
         <w:lastRenderedPageBreak/>
-        <w:t xml:space="preserve">{%p </w:t>
-      </w:r>
-      <w:r>
-        <w:rPr>
-          <w:noProof/>
-          <w:sz w:val="32"/>
-        </w:rPr>
-        <w:t>el</w:t>
-      </w:r>
-      <w:r>
-        <w:rPr>
-          <w:noProof/>
-          <w:sz w:val="32"/>
-        </w:rPr>
-        <w:t xml:space="preserve">if case.filed in </w:t>
+        <w:t xml:space="preserve">{%p elif case.filed in </w:t>
       </w:r>
       <w:r>
         <w:rPr>
@@ -1863,7 +1833,7 @@
           <w:sz w:val="28"/>
           <w:szCs w:val="28"/>
         </w:rPr>
-        <w:t>] and len(</w:t>
+        <w:t xml:space="preserve">] and </w:t>
       </w:r>
       <w:r>
         <w:rPr>
@@ -1879,7 +1849,7 @@
           <w:sz w:val="28"/>
           <w:szCs w:val="28"/>
         </w:rPr>
-        <w:t>) == 0 %}</w:t>
+        <w:t xml:space="preserve"> == 0 %}</w:t>
       </w:r>
     </w:p>
     <w:tbl>
@@ -2846,21 +2816,7 @@
           <w:sz w:val="32"/>
         </w:rPr>
         <w:lastRenderedPageBreak/>
-        <w:t xml:space="preserve">{%p </w:t>
-      </w:r>
-      <w:r>
-        <w:rPr>
-          <w:noProof/>
-          <w:sz w:val="32"/>
-        </w:rPr>
-        <w:t>el</w:t>
-      </w:r>
-      <w:r>
-        <w:rPr>
-          <w:noProof/>
-          <w:sz w:val="32"/>
-        </w:rPr>
-        <w:t xml:space="preserve">if case.filed in </w:t>
+        <w:t xml:space="preserve">{%p elif case.filed in </w:t>
       </w:r>
       <w:r>
         <w:rPr>
@@ -2876,7 +2832,7 @@
           <w:sz w:val="28"/>
           <w:szCs w:val="28"/>
         </w:rPr>
-        <w:t>] and len(</w:t>
+        <w:t xml:space="preserve">] and </w:t>
       </w:r>
       <w:r>
         <w:rPr>
@@ -2892,23 +2848,7 @@
           <w:sz w:val="28"/>
           <w:szCs w:val="28"/>
         </w:rPr>
-        <w:t xml:space="preserve">) </w:t>
-      </w:r>
-      <w:r>
-        <w:rPr>
-          <w:rFonts w:ascii="Times New Roman" w:hAnsi="Times New Roman" w:cs="Times New Roman"/>
-          <w:sz w:val="28"/>
-          <w:szCs w:val="28"/>
-        </w:rPr>
-        <w:t>&gt;</w:t>
-      </w:r>
-      <w:r>
-        <w:rPr>
-          <w:rFonts w:ascii="Times New Roman" w:hAnsi="Times New Roman" w:cs="Times New Roman"/>
-          <w:sz w:val="28"/>
-          <w:szCs w:val="28"/>
-        </w:rPr>
-        <w:t xml:space="preserve"> 0 %}</w:t>
+        <w:t xml:space="preserve"> &gt; 0 %}</w:t>
       </w:r>
     </w:p>
     <w:tbl>
@@ -3885,21 +3825,7 @@
           <w:sz w:val="32"/>
         </w:rPr>
         <w:lastRenderedPageBreak/>
-        <w:t xml:space="preserve">{%p </w:t>
-      </w:r>
-      <w:r>
-        <w:rPr>
-          <w:noProof/>
-          <w:sz w:val="32"/>
-        </w:rPr>
-        <w:t>el</w:t>
-      </w:r>
-      <w:r>
-        <w:rPr>
-          <w:noProof/>
-          <w:sz w:val="32"/>
-        </w:rPr>
-        <w:t xml:space="preserve">if case.filed in </w:t>
+        <w:t xml:space="preserve">{%p elif case.filed in </w:t>
       </w:r>
       <w:r>
         <w:rPr>
@@ -3931,7 +3857,7 @@
           <w:sz w:val="28"/>
           <w:szCs w:val="28"/>
         </w:rPr>
-        <w:t>] and len(</w:t>
+        <w:t xml:space="preserve">] and </w:t>
       </w:r>
       <w:r>
         <w:rPr>
@@ -3947,23 +3873,7 @@
           <w:sz w:val="28"/>
           <w:szCs w:val="28"/>
         </w:rPr>
-        <w:t xml:space="preserve">) </w:t>
-      </w:r>
-      <w:r>
-        <w:rPr>
-          <w:rFonts w:ascii="Times New Roman" w:hAnsi="Times New Roman" w:cs="Times New Roman"/>
-          <w:sz w:val="28"/>
-          <w:szCs w:val="28"/>
-        </w:rPr>
-        <w:t xml:space="preserve">&gt; </w:t>
-      </w:r>
-      <w:r>
-        <w:rPr>
-          <w:rFonts w:ascii="Times New Roman" w:hAnsi="Times New Roman" w:cs="Times New Roman"/>
-          <w:sz w:val="28"/>
-          <w:szCs w:val="28"/>
-        </w:rPr>
-        <w:t>0 %}</w:t>
+        <w:t xml:space="preserve"> &gt; 0 %}</w:t>
       </w:r>
     </w:p>
     <w:tbl>
@@ -4926,103 +4836,90 @@
       <w:pPr>
         <w:rPr>
           <w:rFonts w:ascii="Times New Roman" w:hAnsi="Times New Roman" w:cs="Times New Roman"/>
-          <w:sz w:val="28"/>
-          <w:szCs w:val="28"/>
+          <w:sz w:val="20"/>
+          <w:szCs w:val="20"/>
         </w:rPr>
       </w:pPr>
       <w:r>
         <w:rPr>
           <w:noProof/>
-          <w:sz w:val="32"/>
+          <w:sz w:val="20"/>
+          <w:szCs w:val="20"/>
         </w:rPr>
         <w:lastRenderedPageBreak/>
-        <w:t xml:space="preserve">{%p </w:t>
-      </w:r>
-      <w:r>
-        <w:rPr>
-          <w:noProof/>
-          <w:sz w:val="32"/>
-        </w:rPr>
-        <w:t>el</w:t>
-      </w:r>
-      <w:r>
-        <w:rPr>
-          <w:noProof/>
-          <w:sz w:val="32"/>
-        </w:rPr>
-        <w:t xml:space="preserve">if case.filed in </w:t>
-      </w:r>
-      <w:r>
-        <w:rPr>
-          <w:rFonts w:ascii="Times New Roman" w:hAnsi="Times New Roman" w:cs="Times New Roman"/>
-          <w:sz w:val="28"/>
-          <w:szCs w:val="28"/>
-        </w:rPr>
-        <w:t>["</w:t>
-      </w:r>
-      <w:r>
-        <w:rPr>
-          <w:rFonts w:ascii="Times New Roman" w:hAnsi="Times New Roman" w:cs="Times New Roman"/>
-          <w:sz w:val="28"/>
-          <w:szCs w:val="28"/>
-        </w:rPr>
-        <w:t>other_parties</w:t>
-      </w:r>
-      <w:r>
-        <w:rPr>
-          <w:rFonts w:ascii="Times New Roman" w:hAnsi="Times New Roman" w:cs="Times New Roman"/>
-          <w:sz w:val="28"/>
-          <w:szCs w:val="28"/>
-        </w:rPr>
-        <w:t>0_filed</w:t>
-      </w:r>
-      <w:r>
-        <w:rPr>
-          <w:rFonts w:ascii="Times New Roman" w:hAnsi="Times New Roman" w:cs="Times New Roman"/>
-          <w:sz w:val="28"/>
-          <w:szCs w:val="28"/>
-        </w:rPr>
-        <w:t>"</w:t>
-      </w:r>
-      <w:r>
-        <w:rPr>
-          <w:rFonts w:ascii="Times New Roman" w:hAnsi="Times New Roman" w:cs="Times New Roman"/>
-          <w:sz w:val="28"/>
-          <w:szCs w:val="28"/>
-        </w:rPr>
-        <w:t>] and len(</w:t>
-      </w:r>
-      <w:r>
-        <w:rPr>
-          <w:rFonts w:ascii="Times New Roman" w:hAnsi="Times New Roman" w:cs="Times New Roman"/>
-          <w:sz w:val="28"/>
-          <w:szCs w:val="28"/>
+        <w:t xml:space="preserve">{%p elif case.filed in </w:t>
+      </w:r>
+      <w:r>
+        <w:rPr>
+          <w:rFonts w:ascii="Times New Roman" w:hAnsi="Times New Roman" w:cs="Times New Roman"/>
+          <w:sz w:val="20"/>
+          <w:szCs w:val="20"/>
+        </w:rPr>
+        <w:t>["other_parties</w:t>
+      </w:r>
+      <w:r>
+        <w:rPr>
+          <w:rFonts w:ascii="Times New Roman" w:hAnsi="Times New Roman" w:cs="Times New Roman"/>
+          <w:sz w:val="20"/>
+          <w:szCs w:val="20"/>
+        </w:rPr>
+        <w:t>0</w:t>
+      </w:r>
+      <w:r>
+        <w:rPr>
+          <w:rFonts w:ascii="Times New Roman" w:hAnsi="Times New Roman" w:cs="Times New Roman"/>
+          <w:sz w:val="20"/>
+          <w:szCs w:val="20"/>
+        </w:rPr>
+        <w:t xml:space="preserve">_filed"] and </w:t>
+      </w:r>
+      <w:r>
+        <w:rPr>
+          <w:rFonts w:ascii="Times New Roman" w:hAnsi="Times New Roman" w:cs="Times New Roman"/>
+          <w:sz w:val="20"/>
+          <w:szCs w:val="20"/>
         </w:rPr>
         <w:t>number_of_children</w:t>
       </w:r>
       <w:r>
         <w:rPr>
           <w:rFonts w:ascii="Times New Roman" w:hAnsi="Times New Roman" w:cs="Times New Roman"/>
-          <w:sz w:val="28"/>
-          <w:szCs w:val="28"/>
-        </w:rPr>
-        <w:t xml:space="preserve">) </w:t>
-      </w:r>
-      <w:r>
-        <w:rPr>
-          <w:rFonts w:ascii="Times New Roman" w:hAnsi="Times New Roman" w:cs="Times New Roman"/>
-          <w:sz w:val="28"/>
-          <w:szCs w:val="28"/>
+          <w:sz w:val="20"/>
+          <w:szCs w:val="20"/>
+        </w:rPr>
+        <w:t xml:space="preserve"> </w:t>
+      </w:r>
+      <w:r>
+        <w:rPr>
+          <w:rFonts w:ascii="Times New Roman" w:hAnsi="Times New Roman" w:cs="Times New Roman"/>
+          <w:sz w:val="20"/>
+          <w:szCs w:val="20"/>
         </w:rPr>
         <w:t>&gt;</w:t>
       </w:r>
       <w:r>
         <w:rPr>
           <w:rFonts w:ascii="Times New Roman" w:hAnsi="Times New Roman" w:cs="Times New Roman"/>
-          <w:sz w:val="28"/>
-          <w:szCs w:val="28"/>
-        </w:rPr>
-        <w:t xml:space="preserve"> 0 %}</w:t>
+          <w:sz w:val="20"/>
+          <w:szCs w:val="20"/>
+        </w:rPr>
+        <w:t xml:space="preserve"> 0</w:t>
+      </w:r>
+      <w:r>
+        <w:rPr>
+          <w:rFonts w:ascii="Times New Roman" w:hAnsi="Times New Roman" w:cs="Times New Roman"/>
+          <w:sz w:val="20"/>
+          <w:szCs w:val="20"/>
+        </w:rPr>
+        <w:t xml:space="preserve"> %}</w:t>
+      </w:r>
+      <w:r>
+        <w:rPr>
+          <w:rFonts w:ascii="Times New Roman" w:hAnsi="Times New Roman" w:cs="Times New Roman"/>
+          <w:sz w:val="20"/>
+          <w:szCs w:val="20"/>
+        </w:rPr>
+        <w:t xml:space="preserve"> </w:t>
       </w:r>
     </w:p>
     <w:tbl>
@@ -5984,93 +5881,49 @@
       <w:pPr>
         <w:rPr>
           <w:rFonts w:ascii="Times New Roman" w:hAnsi="Times New Roman" w:cs="Times New Roman"/>
-          <w:sz w:val="28"/>
-          <w:szCs w:val="28"/>
+          <w:sz w:val="24"/>
         </w:rPr>
       </w:pPr>
       <w:r>
         <w:rPr>
           <w:noProof/>
-          <w:sz w:val="32"/>
+          <w:sz w:val="24"/>
         </w:rPr>
         <w:lastRenderedPageBreak/>
-        <w:t xml:space="preserve">{%p </w:t>
-      </w:r>
-      <w:r>
-        <w:rPr>
-          <w:noProof/>
-          <w:sz w:val="32"/>
-        </w:rPr>
-        <w:t>el</w:t>
-      </w:r>
-      <w:r>
-        <w:rPr>
-          <w:noProof/>
-          <w:sz w:val="32"/>
-        </w:rPr>
-        <w:t xml:space="preserve">if case.filed in </w:t>
-      </w:r>
-      <w:r>
-        <w:rPr>
-          <w:rFonts w:ascii="Times New Roman" w:hAnsi="Times New Roman" w:cs="Times New Roman"/>
-          <w:sz w:val="28"/>
-          <w:szCs w:val="28"/>
-        </w:rPr>
-        <w:t>["</w:t>
-      </w:r>
-      <w:r>
-        <w:rPr>
-          <w:rFonts w:ascii="Times New Roman" w:hAnsi="Times New Roman" w:cs="Times New Roman"/>
-          <w:sz w:val="28"/>
-          <w:szCs w:val="28"/>
-        </w:rPr>
-        <w:t>other_parties0_filed</w:t>
-      </w:r>
-      <w:r>
-        <w:rPr>
-          <w:rFonts w:ascii="Times New Roman" w:hAnsi="Times New Roman" w:cs="Times New Roman"/>
-          <w:sz w:val="28"/>
-          <w:szCs w:val="28"/>
-        </w:rPr>
-        <w:t>"</w:t>
-      </w:r>
-      <w:r>
-        <w:rPr>
-          <w:rFonts w:ascii="Times New Roman" w:hAnsi="Times New Roman" w:cs="Times New Roman"/>
-          <w:sz w:val="28"/>
-          <w:szCs w:val="28"/>
-        </w:rPr>
-        <w:t>] and len(</w:t>
-      </w:r>
-      <w:r>
-        <w:rPr>
-          <w:rFonts w:ascii="Times New Roman" w:hAnsi="Times New Roman" w:cs="Times New Roman"/>
-          <w:sz w:val="28"/>
-          <w:szCs w:val="28"/>
+        <w:t xml:space="preserve">{%p elif case.filed in </w:t>
+      </w:r>
+      <w:r>
+        <w:rPr>
+          <w:rFonts w:ascii="Times New Roman" w:hAnsi="Times New Roman" w:cs="Times New Roman"/>
+          <w:sz w:val="24"/>
+        </w:rPr>
+        <w:t xml:space="preserve">["other_parties0_filed"] and </w:t>
+      </w:r>
+      <w:r>
+        <w:rPr>
+          <w:rFonts w:ascii="Times New Roman" w:hAnsi="Times New Roman" w:cs="Times New Roman"/>
+          <w:sz w:val="24"/>
         </w:rPr>
         <w:t>number_of_children</w:t>
       </w:r>
       <w:r>
         <w:rPr>
           <w:rFonts w:ascii="Times New Roman" w:hAnsi="Times New Roman" w:cs="Times New Roman"/>
-          <w:sz w:val="28"/>
-          <w:szCs w:val="28"/>
-        </w:rPr>
-        <w:t xml:space="preserve">) </w:t>
-      </w:r>
-      <w:r>
-        <w:rPr>
-          <w:rFonts w:ascii="Times New Roman" w:hAnsi="Times New Roman" w:cs="Times New Roman"/>
-          <w:sz w:val="28"/>
-          <w:szCs w:val="28"/>
+          <w:sz w:val="24"/>
+        </w:rPr>
+        <w:t xml:space="preserve"> </w:t>
+      </w:r>
+      <w:r>
+        <w:rPr>
+          <w:rFonts w:ascii="Times New Roman" w:hAnsi="Times New Roman" w:cs="Times New Roman"/>
+          <w:sz w:val="24"/>
         </w:rPr>
         <w:t>==</w:t>
       </w:r>
       <w:r>
         <w:rPr>
           <w:rFonts w:ascii="Times New Roman" w:hAnsi="Times New Roman" w:cs="Times New Roman"/>
-          <w:sz w:val="28"/>
-          <w:szCs w:val="28"/>
+          <w:sz w:val="24"/>
         </w:rPr>
         <w:t xml:space="preserve"> 0 %}</w:t>
       </w:r>
@@ -18329,27 +18182,9 @@
   </w:num>
   <w:num w:numId="44" w16cid:durableId="1154955447">
     <w:abstractNumId w:val="33"/>
-    <w:lvlOverride w:ilvl="0"/>
-    <w:lvlOverride w:ilvl="1"/>
-    <w:lvlOverride w:ilvl="2"/>
-    <w:lvlOverride w:ilvl="3"/>
-    <w:lvlOverride w:ilvl="4"/>
-    <w:lvlOverride w:ilvl="5"/>
-    <w:lvlOverride w:ilvl="6"/>
-    <w:lvlOverride w:ilvl="7"/>
-    <w:lvlOverride w:ilvl="8"/>
   </w:num>
   <w:num w:numId="45" w16cid:durableId="1466775483">
     <w:abstractNumId w:val="22"/>
-    <w:lvlOverride w:ilvl="0"/>
-    <w:lvlOverride w:ilvl="1"/>
-    <w:lvlOverride w:ilvl="2"/>
-    <w:lvlOverride w:ilvl="3"/>
-    <w:lvlOverride w:ilvl="4"/>
-    <w:lvlOverride w:ilvl="5"/>
-    <w:lvlOverride w:ilvl="6"/>
-    <w:lvlOverride w:ilvl="7"/>
-    <w:lvlOverride w:ilvl="8"/>
   </w:num>
 </w:numbering>
 </file>
@@ -18824,6 +18659,7 @@
   <w:style w:type="character" w:default="1" w:styleId="DefaultParagraphFont">
     <w:name w:val="Default Paragraph Font"/>
     <w:uiPriority w:val="1"/>
+    <w:semiHidden/>
     <w:unhideWhenUsed/>
   </w:style>
   <w:style w:type="table" w:default="1" w:styleId="TableNormal">

</xml_diff>